<commit_message>
Atualiza dados reais da loja e novos ajustes pedidos pelo cliente
- Endereço, horário e WhatsApp reais (Rua Dr. Jorge Fayet, 624; seg-sex 9h-18h30, sáb 9h-17h; (51) 98910-3293)
- Categoria "Bebês" removida e substituída por "Neurodivergência & Sensorial"
- Hero da home: link de atalho para localização e menção à entrega (3h em POA, Correios p/ Brasil)
- Seção "Marcas que trabalhamos" atualizada com as 12 fábricas reais informadas pelo cliente
- FAQ e schemas (openingHoursSpecification, PostalAddress, FAQPage) sincronizados com os dados novos
- Documentação (README, GUIA-ELEMENTOR, levantamento-logos-marcas.docx) atualizada
</commit_message>
<xml_diff>
--- a/levantamento-logos-marcas.docx
+++ b/levantamento-logos-marcas.docx
@@ -37,7 +37,7 @@
           <w:sz w:val="26"/>
           <w:szCs w:val="26"/>
         </w:rPr>
-        <w:t xml:space="preserve">Levantamento de Logos das Marcas Parceiras</w:t>
+        <w:t xml:space="preserve">Levantamento de Logos das Fábricas Parceiras</w:t>
       </w:r>
     </w:p>
     <w:tbl>
@@ -150,7 +150,7 @@
           <w:sz w:val="44"/>
           <w:szCs w:val="44"/>
         </w:rPr>
-        <w:t xml:space="preserve">Marcas a levantar (11)</w:t>
+        <w:t xml:space="preserve">Fábricas a levantar (12)</w:t>
       </w:r>
     </w:p>
     <w:tbl>
@@ -169,13 +169,11 @@
         <w:gridCol w:w="100"/>
         <w:gridCol w:w="100"/>
         <w:gridCol w:w="100"/>
-        <w:gridCol w:w="100"/>
-        <w:gridCol w:w="100"/>
       </w:tblGrid>
       <w:tr>
         <w:tc>
           <w:tcPr>
-            <w:tcW w:type="pct" w:w="20%"/>
+            <w:tcW w:type="pct" w:w="30%"/>
             <w:tcBorders>
               <w:top w:val="single" w:color="E2E8F0" w:sz="4"/>
               <w:left w:val="single" w:color="E2E8F0" w:sz="4"/>
@@ -213,7 +211,7 @@
         </w:tc>
         <w:tc>
           <w:tcPr>
-            <w:tcW w:type="pct" w:w="32%"/>
+            <w:tcW w:type="pct" w:w="40%"/>
             <w:tcBorders>
               <w:top w:val="single" w:color="E2E8F0" w:sz="4"/>
               <w:left w:val="single" w:color="E2E8F0" w:sz="4"/>
@@ -232,7 +230,7 @@
           <w:p>
             <w:pPr>
               <w:spacing w:after="120" w:before="0"/>
-              <w:jc w:val="left"/>
+              <w:jc w:val="center"/>
             </w:pPr>
             <w:r>
               <w:rPr>
@@ -245,13 +243,13 @@
                 <w:sz w:val="22"/>
                 <w:szCs w:val="22"/>
               </w:rPr>
-              <w:t xml:space="preserve">Linha / produto usado no site</w:t>
-            </w:r>
-          </w:p>
-        </w:tc>
-        <w:tc>
-          <w:tcPr>
-            <w:tcW w:type="pct" w:w="20%"/>
+              <w:t xml:space="preserve">Logo</w:t>
+            </w:r>
+          </w:p>
+        </w:tc>
+        <w:tc>
+          <w:tcPr>
+            <w:tcW w:type="pct" w:w="30%"/>
             <w:tcBorders>
               <w:top w:val="single" w:color="E2E8F0" w:sz="4"/>
               <w:left w:val="single" w:color="E2E8F0" w:sz="4"/>
@@ -283,32 +281,33 @@
                 <w:sz w:val="22"/>
                 <w:szCs w:val="22"/>
               </w:rPr>
-              <w:t xml:space="preserve">Logo</w:t>
-            </w:r>
-          </w:p>
-        </w:tc>
-        <w:tc>
-          <w:tcPr>
-            <w:tcW w:type="pct" w:w="16%"/>
-            <w:tcBorders>
-              <w:top w:val="single" w:color="E2E8F0" w:sz="4"/>
-              <w:left w:val="single" w:color="E2E8F0" w:sz="4"/>
-              <w:bottom w:val="single" w:color="E2E8F0" w:sz="4"/>
-              <w:right w:val="single" w:color="E2E8F0" w:sz="4"/>
-            </w:tcBorders>
-            <w:shd w:fill="1B2A4A" w:val="clear"/>
-            <w:tcMar>
-              <w:top w:type="dxa" w:w="110"/>
-              <w:left w:type="dxa" w:w="140"/>
-              <w:bottom w:type="dxa" w:w="110"/>
-              <w:right w:type="dxa" w:w="140"/>
-            </w:tcMar>
-            <w:vAlign w:val="center"/>
-          </w:tcPr>
-          <w:p>
-            <w:pPr>
-              <w:spacing w:after="120" w:before="0"/>
-              <w:jc w:val="center"/>
+              <w:t xml:space="preserve">Status</w:t>
+            </w:r>
+          </w:p>
+        </w:tc>
+      </w:tr>
+      <w:tr>
+        <w:tc>
+          <w:tcPr>
+            <w:tcW w:type="pct" w:w="30%"/>
+            <w:tcBorders>
+              <w:top w:val="single" w:color="E2E8F0" w:sz="4"/>
+              <w:left w:val="single" w:color="E2E8F0" w:sz="4"/>
+              <w:bottom w:val="single" w:color="E2E8F0" w:sz="4"/>
+              <w:right w:val="single" w:color="E2E8F0" w:sz="4"/>
+            </w:tcBorders>
+            <w:tcMar>
+              <w:top w:type="dxa" w:w="110"/>
+              <w:left w:type="dxa" w:w="140"/>
+              <w:bottom w:type="dxa" w:w="110"/>
+              <w:right w:type="dxa" w:w="140"/>
+            </w:tcMar>
+            <w:vAlign w:val="center"/>
+          </w:tcPr>
+          <w:p>
+            <w:pPr>
+              <w:spacing w:after="120" w:before="0"/>
+              <w:jc w:val="left"/>
             </w:pPr>
             <w:r>
               <w:rPr>
@@ -317,131 +316,17 @@
                 <w:bCs/>
                 <w:i w:val="false"/>
                 <w:iCs w:val="false"/>
-                <w:color w:val="FFFFFF"/>
-                <w:sz w:val="22"/>
-                <w:szCs w:val="22"/>
-              </w:rPr>
-              <w:t xml:space="preserve">Onde conseguir</w:t>
-            </w:r>
-          </w:p>
-        </w:tc>
-        <w:tc>
-          <w:tcPr>
-            <w:tcW w:type="pct" w:w="12%"/>
-            <w:tcBorders>
-              <w:top w:val="single" w:color="E2E8F0" w:sz="4"/>
-              <w:left w:val="single" w:color="E2E8F0" w:sz="4"/>
-              <w:bottom w:val="single" w:color="E2E8F0" w:sz="4"/>
-              <w:right w:val="single" w:color="E2E8F0" w:sz="4"/>
-            </w:tcBorders>
-            <w:shd w:fill="1B2A4A" w:val="clear"/>
-            <w:tcMar>
-              <w:top w:type="dxa" w:w="110"/>
-              <w:left w:type="dxa" w:w="140"/>
-              <w:bottom w:type="dxa" w:w="110"/>
-              <w:right w:type="dxa" w:w="140"/>
-            </w:tcMar>
-            <w:vAlign w:val="center"/>
-          </w:tcPr>
-          <w:p>
-            <w:pPr>
-              <w:spacing w:after="120" w:before="0"/>
-              <w:jc w:val="center"/>
-            </w:pPr>
-            <w:r>
-              <w:rPr>
-                <w:rFonts w:ascii="Arial" w:cs="Arial" w:eastAsia="Arial" w:hAnsi="Arial"/>
-                <w:b/>
-                <w:bCs/>
-                <w:i w:val="false"/>
-                <w:iCs w:val="false"/>
-                <w:color w:val="FFFFFF"/>
-                <w:sz w:val="22"/>
-                <w:szCs w:val="22"/>
-              </w:rPr>
-              <w:t xml:space="preserve">Status</w:t>
-            </w:r>
-          </w:p>
-        </w:tc>
-      </w:tr>
-      <w:tr>
-        <w:tc>
-          <w:tcPr>
-            <w:tcW w:type="pct" w:w="20%"/>
-            <w:tcBorders>
-              <w:top w:val="single" w:color="E2E8F0" w:sz="4"/>
-              <w:left w:val="single" w:color="E2E8F0" w:sz="4"/>
-              <w:bottom w:val="single" w:color="E2E8F0" w:sz="4"/>
-              <w:right w:val="single" w:color="E2E8F0" w:sz="4"/>
-            </w:tcBorders>
-            <w:tcMar>
-              <w:top w:type="dxa" w:w="110"/>
-              <w:left w:type="dxa" w:w="140"/>
-              <w:bottom w:type="dxa" w:w="110"/>
-              <w:right w:type="dxa" w:w="140"/>
-            </w:tcMar>
-            <w:vAlign w:val="center"/>
-          </w:tcPr>
-          <w:p>
-            <w:pPr>
-              <w:spacing w:after="120" w:before="0"/>
-              <w:jc w:val="left"/>
-            </w:pPr>
-            <w:r>
-              <w:rPr>
-                <w:rFonts w:ascii="Arial" w:cs="Arial" w:eastAsia="Arial" w:hAnsi="Arial"/>
-                <w:b/>
-                <w:bCs/>
-                <w:i w:val="false"/>
-                <w:iCs w:val="false"/>
                 <w:color w:val="1E293B"/>
                 <w:sz w:val="22"/>
                 <w:szCs w:val="22"/>
               </w:rPr>
-              <w:t xml:space="preserve">Xcell / X-cell</w:t>
-            </w:r>
-          </w:p>
-        </w:tc>
-        <w:tc>
-          <w:tcPr>
-            <w:tcW w:type="pct" w:w="32%"/>
-            <w:tcBorders>
-              <w:top w:val="single" w:color="E2E8F0" w:sz="4"/>
-              <w:left w:val="single" w:color="E2E8F0" w:sz="4"/>
-              <w:bottom w:val="single" w:color="E2E8F0" w:sz="4"/>
-              <w:right w:val="single" w:color="E2E8F0" w:sz="4"/>
-            </w:tcBorders>
-            <w:tcMar>
-              <w:top w:type="dxa" w:w="110"/>
-              <w:left w:type="dxa" w:w="140"/>
-              <w:bottom w:type="dxa" w:w="110"/>
-              <w:right w:type="dxa" w:w="140"/>
-            </w:tcMar>
-            <w:vAlign w:val="center"/>
-          </w:tcPr>
-          <w:p>
-            <w:pPr>
-              <w:spacing w:after="120" w:before="0"/>
-              <w:jc w:val="left"/>
-            </w:pPr>
-            <w:r>
-              <w:rPr>
-                <w:rFonts w:ascii="Arial" w:cs="Arial" w:eastAsia="Arial" w:hAnsi="Arial"/>
-                <w:b w:val="false"/>
-                <w:bCs w:val="false"/>
-                <w:i w:val="false"/>
-                <w:iCs w:val="false"/>
-                <w:color w:val="1E293B"/>
-                <w:sz w:val="22"/>
-                <w:szCs w:val="22"/>
-              </w:rPr>
-              <w:t xml:space="preserve">Maletas, carrinhos de fricção, mordedores, tapete musical</w:t>
-            </w:r>
-          </w:p>
-        </w:tc>
-        <w:tc>
-          <w:tcPr>
-            <w:tcW w:type="pct" w:w="20%"/>
+              <w:t xml:space="preserve">Xalingo</w:t>
+            </w:r>
+          </w:p>
+        </w:tc>
+        <w:tc>
+          <w:tcPr>
+            <w:tcW w:type="pct" w:w="40%"/>
             <w:tcBorders>
               <w:top w:val="dashed" w:color="94A3B8" w:sz="6"/>
               <w:left w:val="dashed" w:color="94A3B8" w:sz="6"/>
@@ -478,44 +363,7 @@
         </w:tc>
         <w:tc>
           <w:tcPr>
-            <w:tcW w:type="pct" w:w="16%"/>
-            <w:tcBorders>
-              <w:top w:val="single" w:color="E2E8F0" w:sz="4"/>
-              <w:left w:val="single" w:color="E2E8F0" w:sz="4"/>
-              <w:bottom w:val="single" w:color="E2E8F0" w:sz="4"/>
-              <w:right w:val="single" w:color="E2E8F0" w:sz="4"/>
-            </w:tcBorders>
-            <w:tcMar>
-              <w:top w:type="dxa" w:w="110"/>
-              <w:left w:type="dxa" w:w="140"/>
-              <w:bottom w:type="dxa" w:w="110"/>
-              <w:right w:type="dxa" w:w="140"/>
-            </w:tcMar>
-            <w:vAlign w:val="center"/>
-          </w:tcPr>
-          <w:p>
-            <w:pPr>
-              <w:spacing w:after="120" w:before="0"/>
-              <w:jc w:val="left"/>
-            </w:pPr>
-            <w:r>
-              <w:rPr>
-                <w:rFonts w:ascii="Arial" w:cs="Arial" w:eastAsia="Arial" w:hAnsi="Arial"/>
-                <w:b w:val="false"/>
-                <w:bCs w:val="false"/>
-                <w:i w:val="false"/>
-                <w:iCs w:val="false"/>
-                <w:color w:val="1E293B"/>
-                <w:sz w:val="22"/>
-                <w:szCs w:val="22"/>
-              </w:rPr>
-              <w:t xml:space="preserve"/>
-            </w:r>
-          </w:p>
-        </w:tc>
-        <w:tc>
-          <w:tcPr>
-            <w:tcW w:type="pct" w:w="12%"/>
+            <w:tcW w:type="pct" w:w="30%"/>
             <w:tcBorders>
               <w:top w:val="single" w:color="E2E8F0" w:sz="4"/>
               <w:left w:val="single" w:color="E2E8F0" w:sz="4"/>
@@ -554,7 +402,7 @@
       <w:tr>
         <w:tc>
           <w:tcPr>
-            <w:tcW w:type="pct" w:w="20%"/>
+            <w:tcW w:type="pct" w:w="30%"/>
             <w:tcBorders>
               <w:top w:val="single" w:color="E2E8F0" w:sz="4"/>
               <w:left w:val="single" w:color="E2E8F0" w:sz="4"/>
@@ -585,50 +433,13 @@
                 <w:sz w:val="22"/>
                 <w:szCs w:val="22"/>
               </w:rPr>
-              <w:t xml:space="preserve">Zoop Toys</w:t>
-            </w:r>
-          </w:p>
-        </w:tc>
-        <w:tc>
-          <w:tcPr>
-            <w:tcW w:type="pct" w:w="32%"/>
-            <w:tcBorders>
-              <w:top w:val="single" w:color="E2E8F0" w:sz="4"/>
-              <w:left w:val="single" w:color="E2E8F0" w:sz="4"/>
-              <w:bottom w:val="single" w:color="E2E8F0" w:sz="4"/>
-              <w:right w:val="single" w:color="E2E8F0" w:sz="4"/>
-            </w:tcBorders>
-            <w:tcMar>
-              <w:top w:type="dxa" w:w="110"/>
-              <w:left w:type="dxa" w:w="140"/>
-              <w:bottom w:type="dxa" w:w="110"/>
-              <w:right w:type="dxa" w:w="140"/>
-            </w:tcMar>
-            <w:vAlign w:val="center"/>
-          </w:tcPr>
-          <w:p>
-            <w:pPr>
-              <w:spacing w:after="120" w:before="0"/>
-              <w:jc w:val="left"/>
-            </w:pPr>
-            <w:r>
-              <w:rPr>
-                <w:rFonts w:ascii="Arial" w:cs="Arial" w:eastAsia="Arial" w:hAnsi="Arial"/>
-                <w:b w:val="false"/>
-                <w:bCs w:val="false"/>
-                <w:i w:val="false"/>
-                <w:iCs w:val="false"/>
-                <w:color w:val="1E293B"/>
-                <w:sz w:val="22"/>
-                <w:szCs w:val="22"/>
-              </w:rPr>
-              <w:t xml:space="preserve">Linha "Casinha Feliz"</w:t>
-            </w:r>
-          </w:p>
-        </w:tc>
-        <w:tc>
-          <w:tcPr>
-            <w:tcW w:type="pct" w:w="20%"/>
+              <w:t xml:space="preserve">Brinquedos Babebi</w:t>
+            </w:r>
+          </w:p>
+        </w:tc>
+        <w:tc>
+          <w:tcPr>
+            <w:tcW w:type="pct" w:w="40%"/>
             <w:tcBorders>
               <w:top w:val="dashed" w:color="94A3B8" w:sz="6"/>
               <w:left w:val="dashed" w:color="94A3B8" w:sz="6"/>
@@ -665,44 +476,7 @@
         </w:tc>
         <w:tc>
           <w:tcPr>
-            <w:tcW w:type="pct" w:w="16%"/>
-            <w:tcBorders>
-              <w:top w:val="single" w:color="E2E8F0" w:sz="4"/>
-              <w:left w:val="single" w:color="E2E8F0" w:sz="4"/>
-              <w:bottom w:val="single" w:color="E2E8F0" w:sz="4"/>
-              <w:right w:val="single" w:color="E2E8F0" w:sz="4"/>
-            </w:tcBorders>
-            <w:tcMar>
-              <w:top w:type="dxa" w:w="110"/>
-              <w:left w:type="dxa" w:w="140"/>
-              <w:bottom w:type="dxa" w:w="110"/>
-              <w:right w:type="dxa" w:w="140"/>
-            </w:tcMar>
-            <w:vAlign w:val="center"/>
-          </w:tcPr>
-          <w:p>
-            <w:pPr>
-              <w:spacing w:after="120" w:before="0"/>
-              <w:jc w:val="left"/>
-            </w:pPr>
-            <w:r>
-              <w:rPr>
-                <w:rFonts w:ascii="Arial" w:cs="Arial" w:eastAsia="Arial" w:hAnsi="Arial"/>
-                <w:b w:val="false"/>
-                <w:bCs w:val="false"/>
-                <w:i w:val="false"/>
-                <w:iCs w:val="false"/>
-                <w:color w:val="1E293B"/>
-                <w:sz w:val="22"/>
-                <w:szCs w:val="22"/>
-              </w:rPr>
-              <w:t xml:space="preserve"/>
-            </w:r>
-          </w:p>
-        </w:tc>
-        <w:tc>
-          <w:tcPr>
-            <w:tcW w:type="pct" w:w="12%"/>
+            <w:tcW w:type="pct" w:w="30%"/>
             <w:tcBorders>
               <w:top w:val="single" w:color="E2E8F0" w:sz="4"/>
               <w:left w:val="single" w:color="E2E8F0" w:sz="4"/>
@@ -741,7 +515,7 @@
       <w:tr>
         <w:tc>
           <w:tcPr>
-            <w:tcW w:type="pct" w:w="20%"/>
+            <w:tcW w:type="pct" w:w="30%"/>
             <w:tcBorders>
               <w:top w:val="single" w:color="E2E8F0" w:sz="4"/>
               <w:left w:val="single" w:color="E2E8F0" w:sz="4"/>
@@ -772,50 +546,13 @@
                 <w:sz w:val="22"/>
                 <w:szCs w:val="22"/>
               </w:rPr>
-              <w:t xml:space="preserve">Maxtop</w:t>
-            </w:r>
-          </w:p>
-        </w:tc>
-        <w:tc>
-          <w:tcPr>
-            <w:tcW w:type="pct" w:w="32%"/>
-            <w:tcBorders>
-              <w:top w:val="single" w:color="E2E8F0" w:sz="4"/>
-              <w:left w:val="single" w:color="E2E8F0" w:sz="4"/>
-              <w:bottom w:val="single" w:color="E2E8F0" w:sz="4"/>
-              <w:right w:val="single" w:color="E2E8F0" w:sz="4"/>
-            </w:tcBorders>
-            <w:tcMar>
-              <w:top w:type="dxa" w:w="110"/>
-              <w:left w:type="dxa" w:w="140"/>
-              <w:bottom w:type="dxa" w:w="110"/>
-              <w:right w:type="dxa" w:w="140"/>
-            </w:tcMar>
-            <w:vAlign w:val="center"/>
-          </w:tcPr>
-          <w:p>
-            <w:pPr>
-              <w:spacing w:after="120" w:before="0"/>
-              <w:jc w:val="left"/>
-            </w:pPr>
-            <w:r>
-              <w:rPr>
-                <w:rFonts w:ascii="Arial" w:cs="Arial" w:eastAsia="Arial" w:hAnsi="Arial"/>
-                <w:b w:val="false"/>
-                <w:bCs w:val="false"/>
-                <w:i w:val="false"/>
-                <w:iCs w:val="false"/>
-                <w:color w:val="1E293B"/>
-                <w:sz w:val="22"/>
-                <w:szCs w:val="22"/>
-              </w:rPr>
-              <w:t xml:space="preserve">Lousas mágicas (Kuromi, Sonic)</w:t>
-            </w:r>
-          </w:p>
-        </w:tc>
-        <w:tc>
-          <w:tcPr>
-            <w:tcW w:type="pct" w:w="20%"/>
+              <w:t xml:space="preserve">Janod</w:t>
+            </w:r>
+          </w:p>
+        </w:tc>
+        <w:tc>
+          <w:tcPr>
+            <w:tcW w:type="pct" w:w="40%"/>
             <w:tcBorders>
               <w:top w:val="dashed" w:color="94A3B8" w:sz="6"/>
               <w:left w:val="dashed" w:color="94A3B8" w:sz="6"/>
@@ -852,44 +589,7 @@
         </w:tc>
         <w:tc>
           <w:tcPr>
-            <w:tcW w:type="pct" w:w="16%"/>
-            <w:tcBorders>
-              <w:top w:val="single" w:color="E2E8F0" w:sz="4"/>
-              <w:left w:val="single" w:color="E2E8F0" w:sz="4"/>
-              <w:bottom w:val="single" w:color="E2E8F0" w:sz="4"/>
-              <w:right w:val="single" w:color="E2E8F0" w:sz="4"/>
-            </w:tcBorders>
-            <w:tcMar>
-              <w:top w:type="dxa" w:w="110"/>
-              <w:left w:type="dxa" w:w="140"/>
-              <w:bottom w:type="dxa" w:w="110"/>
-              <w:right w:type="dxa" w:w="140"/>
-            </w:tcMar>
-            <w:vAlign w:val="center"/>
-          </w:tcPr>
-          <w:p>
-            <w:pPr>
-              <w:spacing w:after="120" w:before="0"/>
-              <w:jc w:val="left"/>
-            </w:pPr>
-            <w:r>
-              <w:rPr>
-                <w:rFonts w:ascii="Arial" w:cs="Arial" w:eastAsia="Arial" w:hAnsi="Arial"/>
-                <w:b w:val="false"/>
-                <w:bCs w:val="false"/>
-                <w:i w:val="false"/>
-                <w:iCs w:val="false"/>
-                <w:color w:val="1E293B"/>
-                <w:sz w:val="22"/>
-                <w:szCs w:val="22"/>
-              </w:rPr>
-              <w:t xml:space="preserve"/>
-            </w:r>
-          </w:p>
-        </w:tc>
-        <w:tc>
-          <w:tcPr>
-            <w:tcW w:type="pct" w:w="12%"/>
+            <w:tcW w:type="pct" w:w="30%"/>
             <w:tcBorders>
               <w:top w:val="single" w:color="E2E8F0" w:sz="4"/>
               <w:left w:val="single" w:color="E2E8F0" w:sz="4"/>
@@ -928,7 +628,7 @@
       <w:tr>
         <w:tc>
           <w:tcPr>
-            <w:tcW w:type="pct" w:w="20%"/>
+            <w:tcW w:type="pct" w:w="30%"/>
             <w:tcBorders>
               <w:top w:val="single" w:color="E2E8F0" w:sz="4"/>
               <w:left w:val="single" w:color="E2E8F0" w:sz="4"/>
@@ -959,50 +659,13 @@
                 <w:sz w:val="22"/>
                 <w:szCs w:val="22"/>
               </w:rPr>
-              <w:t xml:space="preserve">Altomex</w:t>
-            </w:r>
-          </w:p>
-        </w:tc>
-        <w:tc>
-          <w:tcPr>
-            <w:tcW w:type="pct" w:w="32%"/>
-            <w:tcBorders>
-              <w:top w:val="single" w:color="E2E8F0" w:sz="4"/>
-              <w:left w:val="single" w:color="E2E8F0" w:sz="4"/>
-              <w:bottom w:val="single" w:color="E2E8F0" w:sz="4"/>
-              <w:right w:val="single" w:color="E2E8F0" w:sz="4"/>
-            </w:tcBorders>
-            <w:tcMar>
-              <w:top w:type="dxa" w:w="110"/>
-              <w:left w:type="dxa" w:w="140"/>
-              <w:bottom w:type="dxa" w:w="110"/>
-              <w:right w:type="dxa" w:w="140"/>
-            </w:tcMar>
-            <w:vAlign w:val="center"/>
-          </w:tcPr>
-          <w:p>
-            <w:pPr>
-              <w:spacing w:after="120" w:before="0"/>
-              <w:jc w:val="left"/>
-            </w:pPr>
-            <w:r>
-              <w:rPr>
-                <w:rFonts w:ascii="Arial" w:cs="Arial" w:eastAsia="Arial" w:hAnsi="Arial"/>
-                <w:b w:val="false"/>
-                <w:bCs w:val="false"/>
-                <w:i w:val="false"/>
-                <w:iCs w:val="false"/>
-                <w:color w:val="1E293B"/>
-                <w:sz w:val="22"/>
-                <w:szCs w:val="22"/>
-              </w:rPr>
-              <w:t xml:space="preserve">Lousa mágica Capivara</w:t>
-            </w:r>
-          </w:p>
-        </w:tc>
-        <w:tc>
-          <w:tcPr>
-            <w:tcW w:type="pct" w:w="20%"/>
+              <w:t xml:space="preserve">Kaloo</w:t>
+            </w:r>
+          </w:p>
+        </w:tc>
+        <w:tc>
+          <w:tcPr>
+            <w:tcW w:type="pct" w:w="40%"/>
             <w:tcBorders>
               <w:top w:val="dashed" w:color="94A3B8" w:sz="6"/>
               <w:left w:val="dashed" w:color="94A3B8" w:sz="6"/>
@@ -1039,44 +702,7 @@
         </w:tc>
         <w:tc>
           <w:tcPr>
-            <w:tcW w:type="pct" w:w="16%"/>
-            <w:tcBorders>
-              <w:top w:val="single" w:color="E2E8F0" w:sz="4"/>
-              <w:left w:val="single" w:color="E2E8F0" w:sz="4"/>
-              <w:bottom w:val="single" w:color="E2E8F0" w:sz="4"/>
-              <w:right w:val="single" w:color="E2E8F0" w:sz="4"/>
-            </w:tcBorders>
-            <w:tcMar>
-              <w:top w:type="dxa" w:w="110"/>
-              <w:left w:type="dxa" w:w="140"/>
-              <w:bottom w:type="dxa" w:w="110"/>
-              <w:right w:type="dxa" w:w="140"/>
-            </w:tcMar>
-            <w:vAlign w:val="center"/>
-          </w:tcPr>
-          <w:p>
-            <w:pPr>
-              <w:spacing w:after="120" w:before="0"/>
-              <w:jc w:val="left"/>
-            </w:pPr>
-            <w:r>
-              <w:rPr>
-                <w:rFonts w:ascii="Arial" w:cs="Arial" w:eastAsia="Arial" w:hAnsi="Arial"/>
-                <w:b w:val="false"/>
-                <w:bCs w:val="false"/>
-                <w:i w:val="false"/>
-                <w:iCs w:val="false"/>
-                <w:color w:val="1E293B"/>
-                <w:sz w:val="22"/>
-                <w:szCs w:val="22"/>
-              </w:rPr>
-              <w:t xml:space="preserve"/>
-            </w:r>
-          </w:p>
-        </w:tc>
-        <w:tc>
-          <w:tcPr>
-            <w:tcW w:type="pct" w:w="12%"/>
+            <w:tcW w:type="pct" w:w="30%"/>
             <w:tcBorders>
               <w:top w:val="single" w:color="E2E8F0" w:sz="4"/>
               <w:left w:val="single" w:color="E2E8F0" w:sz="4"/>
@@ -1115,7 +741,7 @@
       <w:tr>
         <w:tc>
           <w:tcPr>
-            <w:tcW w:type="pct" w:w="20%"/>
+            <w:tcW w:type="pct" w:w="30%"/>
             <w:tcBorders>
               <w:top w:val="single" w:color="E2E8F0" w:sz="4"/>
               <w:left w:val="single" w:color="E2E8F0" w:sz="4"/>
@@ -1146,50 +772,13 @@
                 <w:sz w:val="22"/>
                 <w:szCs w:val="22"/>
               </w:rPr>
-              <w:t xml:space="preserve">Tomate</w:t>
-            </w:r>
-          </w:p>
-        </w:tc>
-        <w:tc>
-          <w:tcPr>
-            <w:tcW w:type="pct" w:w="32%"/>
-            <w:tcBorders>
-              <w:top w:val="single" w:color="E2E8F0" w:sz="4"/>
-              <w:left w:val="single" w:color="E2E8F0" w:sz="4"/>
-              <w:bottom w:val="single" w:color="E2E8F0" w:sz="4"/>
-              <w:right w:val="single" w:color="E2E8F0" w:sz="4"/>
-            </w:tcBorders>
-            <w:tcMar>
-              <w:top w:type="dxa" w:w="110"/>
-              <w:left w:type="dxa" w:w="140"/>
-              <w:bottom w:type="dxa" w:w="110"/>
-              <w:right w:type="dxa" w:w="140"/>
-            </w:tcMar>
-            <w:vAlign w:val="center"/>
-          </w:tcPr>
-          <w:p>
-            <w:pPr>
-              <w:spacing w:after="120" w:before="0"/>
-              <w:jc w:val="left"/>
-            </w:pPr>
-            <w:r>
-              <w:rPr>
-                <w:rFonts w:ascii="Arial" w:cs="Arial" w:eastAsia="Arial" w:hAnsi="Arial"/>
-                <w:b w:val="false"/>
-                <w:bCs w:val="false"/>
-                <w:i w:val="false"/>
-                <w:iCs w:val="false"/>
-                <w:color w:val="1E293B"/>
-                <w:sz w:val="22"/>
-                <w:szCs w:val="22"/>
-              </w:rPr>
-              <w:t xml:space="preserve">Jogo de dardos magnético</w:t>
-            </w:r>
-          </w:p>
-        </w:tc>
-        <w:tc>
-          <w:tcPr>
-            <w:tcW w:type="pct" w:w="20%"/>
+              <w:t xml:space="preserve">Hape / Baby Einstein</w:t>
+            </w:r>
+          </w:p>
+        </w:tc>
+        <w:tc>
+          <w:tcPr>
+            <w:tcW w:type="pct" w:w="40%"/>
             <w:tcBorders>
               <w:top w:val="dashed" w:color="94A3B8" w:sz="6"/>
               <w:left w:val="dashed" w:color="94A3B8" w:sz="6"/>
@@ -1226,44 +815,7 @@
         </w:tc>
         <w:tc>
           <w:tcPr>
-            <w:tcW w:type="pct" w:w="16%"/>
-            <w:tcBorders>
-              <w:top w:val="single" w:color="E2E8F0" w:sz="4"/>
-              <w:left w:val="single" w:color="E2E8F0" w:sz="4"/>
-              <w:bottom w:val="single" w:color="E2E8F0" w:sz="4"/>
-              <w:right w:val="single" w:color="E2E8F0" w:sz="4"/>
-            </w:tcBorders>
-            <w:tcMar>
-              <w:top w:type="dxa" w:w="110"/>
-              <w:left w:type="dxa" w:w="140"/>
-              <w:bottom w:type="dxa" w:w="110"/>
-              <w:right w:type="dxa" w:w="140"/>
-            </w:tcMar>
-            <w:vAlign w:val="center"/>
-          </w:tcPr>
-          <w:p>
-            <w:pPr>
-              <w:spacing w:after="120" w:before="0"/>
-              <w:jc w:val="left"/>
-            </w:pPr>
-            <w:r>
-              <w:rPr>
-                <w:rFonts w:ascii="Arial" w:cs="Arial" w:eastAsia="Arial" w:hAnsi="Arial"/>
-                <w:b w:val="false"/>
-                <w:bCs w:val="false"/>
-                <w:i w:val="false"/>
-                <w:iCs w:val="false"/>
-                <w:color w:val="1E293B"/>
-                <w:sz w:val="22"/>
-                <w:szCs w:val="22"/>
-              </w:rPr>
-              <w:t xml:space="preserve"/>
-            </w:r>
-          </w:p>
-        </w:tc>
-        <w:tc>
-          <w:tcPr>
-            <w:tcW w:type="pct" w:w="12%"/>
+            <w:tcW w:type="pct" w:w="30%"/>
             <w:tcBorders>
               <w:top w:val="single" w:color="E2E8F0" w:sz="4"/>
               <w:left w:val="single" w:color="E2E8F0" w:sz="4"/>
@@ -1302,7 +854,7 @@
       <w:tr>
         <w:tc>
           <w:tcPr>
-            <w:tcW w:type="pct" w:w="20%"/>
+            <w:tcW w:type="pct" w:w="30%"/>
             <w:tcBorders>
               <w:top w:val="single" w:color="E2E8F0" w:sz="4"/>
               <w:left w:val="single" w:color="E2E8F0" w:sz="4"/>
@@ -1333,50 +885,13 @@
                 <w:sz w:val="22"/>
                 <w:szCs w:val="22"/>
               </w:rPr>
-              <w:t xml:space="preserve">Oasis</w:t>
-            </w:r>
-          </w:p>
-        </w:tc>
-        <w:tc>
-          <w:tcPr>
-            <w:tcW w:type="pct" w:w="32%"/>
-            <w:tcBorders>
-              <w:top w:val="single" w:color="E2E8F0" w:sz="4"/>
-              <w:left w:val="single" w:color="E2E8F0" w:sz="4"/>
-              <w:bottom w:val="single" w:color="E2E8F0" w:sz="4"/>
-              <w:right w:val="single" w:color="E2E8F0" w:sz="4"/>
-            </w:tcBorders>
-            <w:tcMar>
-              <w:top w:type="dxa" w:w="110"/>
-              <w:left w:type="dxa" w:w="140"/>
-              <w:bottom w:type="dxa" w:w="110"/>
-              <w:right w:type="dxa" w:w="140"/>
-            </w:tcMar>
-            <w:vAlign w:val="center"/>
-          </w:tcPr>
-          <w:p>
-            <w:pPr>
-              <w:spacing w:after="120" w:before="0"/>
-              <w:jc w:val="left"/>
-            </w:pPr>
-            <w:r>
-              <w:rPr>
-                <w:rFonts w:ascii="Arial" w:cs="Arial" w:eastAsia="Arial" w:hAnsi="Arial"/>
-                <w:b w:val="false"/>
-                <w:bCs w:val="false"/>
-                <w:i w:val="false"/>
-                <w:iCs w:val="false"/>
-                <w:color w:val="1E293B"/>
-                <w:sz w:val="22"/>
-                <w:szCs w:val="22"/>
-              </w:rPr>
-              <w:t xml:space="preserve">Kit raquetes de ping pong</w:t>
-            </w:r>
-          </w:p>
-        </w:tc>
-        <w:tc>
-          <w:tcPr>
-            <w:tcW w:type="pct" w:w="20%"/>
+              <w:t xml:space="preserve">NIG Brinquedos</w:t>
+            </w:r>
+          </w:p>
+        </w:tc>
+        <w:tc>
+          <w:tcPr>
+            <w:tcW w:type="pct" w:w="40%"/>
             <w:tcBorders>
               <w:top w:val="dashed" w:color="94A3B8" w:sz="6"/>
               <w:left w:val="dashed" w:color="94A3B8" w:sz="6"/>
@@ -1413,44 +928,7 @@
         </w:tc>
         <w:tc>
           <w:tcPr>
-            <w:tcW w:type="pct" w:w="16%"/>
-            <w:tcBorders>
-              <w:top w:val="single" w:color="E2E8F0" w:sz="4"/>
-              <w:left w:val="single" w:color="E2E8F0" w:sz="4"/>
-              <w:bottom w:val="single" w:color="E2E8F0" w:sz="4"/>
-              <w:right w:val="single" w:color="E2E8F0" w:sz="4"/>
-            </w:tcBorders>
-            <w:tcMar>
-              <w:top w:type="dxa" w:w="110"/>
-              <w:left w:type="dxa" w:w="140"/>
-              <w:bottom w:type="dxa" w:w="110"/>
-              <w:right w:type="dxa" w:w="140"/>
-            </w:tcMar>
-            <w:vAlign w:val="center"/>
-          </w:tcPr>
-          <w:p>
-            <w:pPr>
-              <w:spacing w:after="120" w:before="0"/>
-              <w:jc w:val="left"/>
-            </w:pPr>
-            <w:r>
-              <w:rPr>
-                <w:rFonts w:ascii="Arial" w:cs="Arial" w:eastAsia="Arial" w:hAnsi="Arial"/>
-                <w:b w:val="false"/>
-                <w:bCs w:val="false"/>
-                <w:i w:val="false"/>
-                <w:iCs w:val="false"/>
-                <w:color w:val="1E293B"/>
-                <w:sz w:val="22"/>
-                <w:szCs w:val="22"/>
-              </w:rPr>
-              <w:t xml:space="preserve"/>
-            </w:r>
-          </w:p>
-        </w:tc>
-        <w:tc>
-          <w:tcPr>
-            <w:tcW w:type="pct" w:w="12%"/>
+            <w:tcW w:type="pct" w:w="30%"/>
             <w:tcBorders>
               <w:top w:val="single" w:color="E2E8F0" w:sz="4"/>
               <w:left w:val="single" w:color="E2E8F0" w:sz="4"/>
@@ -1489,7 +967,7 @@
       <w:tr>
         <w:tc>
           <w:tcPr>
-            <w:tcW w:type="pct" w:w="20%"/>
+            <w:tcW w:type="pct" w:w="30%"/>
             <w:tcBorders>
               <w:top w:val="single" w:color="E2E8F0" w:sz="4"/>
               <w:left w:val="single" w:color="E2E8F0" w:sz="4"/>
@@ -1520,50 +998,13 @@
                 <w:sz w:val="22"/>
                 <w:szCs w:val="22"/>
               </w:rPr>
-              <w:t xml:space="preserve">Onshine</w:t>
-            </w:r>
-          </w:p>
-        </w:tc>
-        <w:tc>
-          <w:tcPr>
-            <w:tcW w:type="pct" w:w="32%"/>
-            <w:tcBorders>
-              <w:top w:val="single" w:color="E2E8F0" w:sz="4"/>
-              <w:left w:val="single" w:color="E2E8F0" w:sz="4"/>
-              <w:bottom w:val="single" w:color="E2E8F0" w:sz="4"/>
-              <w:right w:val="single" w:color="E2E8F0" w:sz="4"/>
-            </w:tcBorders>
-            <w:tcMar>
-              <w:top w:type="dxa" w:w="110"/>
-              <w:left w:type="dxa" w:w="140"/>
-              <w:bottom w:type="dxa" w:w="110"/>
-              <w:right w:type="dxa" w:w="140"/>
-            </w:tcMar>
-            <w:vAlign w:val="center"/>
-          </w:tcPr>
-          <w:p>
-            <w:pPr>
-              <w:spacing w:after="120" w:before="0"/>
-              <w:jc w:val="left"/>
-            </w:pPr>
-            <w:r>
-              <w:rPr>
-                <w:rFonts w:ascii="Arial" w:cs="Arial" w:eastAsia="Arial" w:hAnsi="Arial"/>
-                <w:b w:val="false"/>
-                <w:bCs w:val="false"/>
-                <w:i w:val="false"/>
-                <w:iCs w:val="false"/>
-                <w:color w:val="1E293B"/>
-                <w:sz w:val="22"/>
-                <w:szCs w:val="22"/>
-              </w:rPr>
-              <w:t xml:space="preserve">Varinha mágica de bolhas de fumaça</w:t>
-            </w:r>
-          </w:p>
-        </w:tc>
-        <w:tc>
-          <w:tcPr>
-            <w:tcW w:type="pct" w:w="20%"/>
+              <w:t xml:space="preserve">Pakitoys</w:t>
+            </w:r>
+          </w:p>
+        </w:tc>
+        <w:tc>
+          <w:tcPr>
+            <w:tcW w:type="pct" w:w="40%"/>
             <w:tcBorders>
               <w:top w:val="dashed" w:color="94A3B8" w:sz="6"/>
               <w:left w:val="dashed" w:color="94A3B8" w:sz="6"/>
@@ -1600,44 +1041,7 @@
         </w:tc>
         <w:tc>
           <w:tcPr>
-            <w:tcW w:type="pct" w:w="16%"/>
-            <w:tcBorders>
-              <w:top w:val="single" w:color="E2E8F0" w:sz="4"/>
-              <w:left w:val="single" w:color="E2E8F0" w:sz="4"/>
-              <w:bottom w:val="single" w:color="E2E8F0" w:sz="4"/>
-              <w:right w:val="single" w:color="E2E8F0" w:sz="4"/>
-            </w:tcBorders>
-            <w:tcMar>
-              <w:top w:type="dxa" w:w="110"/>
-              <w:left w:type="dxa" w:w="140"/>
-              <w:bottom w:type="dxa" w:w="110"/>
-              <w:right w:type="dxa" w:w="140"/>
-            </w:tcMar>
-            <w:vAlign w:val="center"/>
-          </w:tcPr>
-          <w:p>
-            <w:pPr>
-              <w:spacing w:after="120" w:before="0"/>
-              <w:jc w:val="left"/>
-            </w:pPr>
-            <w:r>
-              <w:rPr>
-                <w:rFonts w:ascii="Arial" w:cs="Arial" w:eastAsia="Arial" w:hAnsi="Arial"/>
-                <w:b w:val="false"/>
-                <w:bCs w:val="false"/>
-                <w:i w:val="false"/>
-                <w:iCs w:val="false"/>
-                <w:color w:val="1E293B"/>
-                <w:sz w:val="22"/>
-                <w:szCs w:val="22"/>
-              </w:rPr>
-              <w:t xml:space="preserve"/>
-            </w:r>
-          </w:p>
-        </w:tc>
-        <w:tc>
-          <w:tcPr>
-            <w:tcW w:type="pct" w:w="12%"/>
+            <w:tcW w:type="pct" w:w="30%"/>
             <w:tcBorders>
               <w:top w:val="single" w:color="E2E8F0" w:sz="4"/>
               <w:left w:val="single" w:color="E2E8F0" w:sz="4"/>
@@ -1676,7 +1080,7 @@
       <w:tr>
         <w:tc>
           <w:tcPr>
-            <w:tcW w:type="pct" w:w="20%"/>
+            <w:tcW w:type="pct" w:w="30%"/>
             <w:tcBorders>
               <w:top w:val="single" w:color="E2E8F0" w:sz="4"/>
               <w:left w:val="single" w:color="E2E8F0" w:sz="4"/>
@@ -1707,50 +1111,13 @@
                 <w:sz w:val="22"/>
                 <w:szCs w:val="22"/>
               </w:rPr>
-              <w:t xml:space="preserve">Adijomar</w:t>
-            </w:r>
-          </w:p>
-        </w:tc>
-        <w:tc>
-          <w:tcPr>
-            <w:tcW w:type="pct" w:w="32%"/>
-            <w:tcBorders>
-              <w:top w:val="single" w:color="E2E8F0" w:sz="4"/>
-              <w:left w:val="single" w:color="E2E8F0" w:sz="4"/>
-              <w:bottom w:val="single" w:color="E2E8F0" w:sz="4"/>
-              <w:right w:val="single" w:color="E2E8F0" w:sz="4"/>
-            </w:tcBorders>
-            <w:tcMar>
-              <w:top w:type="dxa" w:w="110"/>
-              <w:left w:type="dxa" w:w="140"/>
-              <w:bottom w:type="dxa" w:w="110"/>
-              <w:right w:type="dxa" w:w="140"/>
-            </w:tcMar>
-            <w:vAlign w:val="center"/>
-          </w:tcPr>
-          <w:p>
-            <w:pPr>
-              <w:spacing w:after="120" w:before="0"/>
-              <w:jc w:val="left"/>
-            </w:pPr>
-            <w:r>
-              <w:rPr>
-                <w:rFonts w:ascii="Arial" w:cs="Arial" w:eastAsia="Arial" w:hAnsi="Arial"/>
-                <w:b w:val="false"/>
-                <w:bCs w:val="false"/>
-                <w:i w:val="false"/>
-                <w:iCs w:val="false"/>
-                <w:color w:val="1E293B"/>
-                <w:sz w:val="22"/>
-                <w:szCs w:val="22"/>
-              </w:rPr>
-              <w:t xml:space="preserve">Carregadeira de brinquedo</w:t>
-            </w:r>
-          </w:p>
-        </w:tc>
-        <w:tc>
-          <w:tcPr>
-            <w:tcW w:type="pct" w:w="20%"/>
+              <w:t xml:space="preserve">Happy Books</w:t>
+            </w:r>
+          </w:p>
+        </w:tc>
+        <w:tc>
+          <w:tcPr>
+            <w:tcW w:type="pct" w:w="40%"/>
             <w:tcBorders>
               <w:top w:val="dashed" w:color="94A3B8" w:sz="6"/>
               <w:left w:val="dashed" w:color="94A3B8" w:sz="6"/>
@@ -1787,44 +1154,7 @@
         </w:tc>
         <w:tc>
           <w:tcPr>
-            <w:tcW w:type="pct" w:w="16%"/>
-            <w:tcBorders>
-              <w:top w:val="single" w:color="E2E8F0" w:sz="4"/>
-              <w:left w:val="single" w:color="E2E8F0" w:sz="4"/>
-              <w:bottom w:val="single" w:color="E2E8F0" w:sz="4"/>
-              <w:right w:val="single" w:color="E2E8F0" w:sz="4"/>
-            </w:tcBorders>
-            <w:tcMar>
-              <w:top w:type="dxa" w:w="110"/>
-              <w:left w:type="dxa" w:w="140"/>
-              <w:bottom w:type="dxa" w:w="110"/>
-              <w:right w:type="dxa" w:w="140"/>
-            </w:tcMar>
-            <w:vAlign w:val="center"/>
-          </w:tcPr>
-          <w:p>
-            <w:pPr>
-              <w:spacing w:after="120" w:before="0"/>
-              <w:jc w:val="left"/>
-            </w:pPr>
-            <w:r>
-              <w:rPr>
-                <w:rFonts w:ascii="Arial" w:cs="Arial" w:eastAsia="Arial" w:hAnsi="Arial"/>
-                <w:b w:val="false"/>
-                <w:bCs w:val="false"/>
-                <w:i w:val="false"/>
-                <w:iCs w:val="false"/>
-                <w:color w:val="1E293B"/>
-                <w:sz w:val="22"/>
-                <w:szCs w:val="22"/>
-              </w:rPr>
-              <w:t xml:space="preserve"/>
-            </w:r>
-          </w:p>
-        </w:tc>
-        <w:tc>
-          <w:tcPr>
-            <w:tcW w:type="pct" w:w="12%"/>
+            <w:tcW w:type="pct" w:w="30%"/>
             <w:tcBorders>
               <w:top w:val="single" w:color="E2E8F0" w:sz="4"/>
               <w:left w:val="single" w:color="E2E8F0" w:sz="4"/>
@@ -1863,7 +1193,7 @@
       <w:tr>
         <w:tc>
           <w:tcPr>
-            <w:tcW w:type="pct" w:w="20%"/>
+            <w:tcW w:type="pct" w:w="30%"/>
             <w:tcBorders>
               <w:top w:val="single" w:color="E2E8F0" w:sz="4"/>
               <w:left w:val="single" w:color="E2E8F0" w:sz="4"/>
@@ -1894,50 +1224,13 @@
                 <w:sz w:val="22"/>
                 <w:szCs w:val="22"/>
               </w:rPr>
-              <w:t xml:space="preserve">Diver Toys / Mister Massas</w:t>
-            </w:r>
-          </w:p>
-        </w:tc>
-        <w:tc>
-          <w:tcPr>
-            <w:tcW w:type="pct" w:w="32%"/>
-            <w:tcBorders>
-              <w:top w:val="single" w:color="E2E8F0" w:sz="4"/>
-              <w:left w:val="single" w:color="E2E8F0" w:sz="4"/>
-              <w:bottom w:val="single" w:color="E2E8F0" w:sz="4"/>
-              <w:right w:val="single" w:color="E2E8F0" w:sz="4"/>
-            </w:tcBorders>
-            <w:tcMar>
-              <w:top w:type="dxa" w:w="110"/>
-              <w:left w:type="dxa" w:w="140"/>
-              <w:bottom w:type="dxa" w:w="110"/>
-              <w:right w:type="dxa" w:w="140"/>
-            </w:tcMar>
-            <w:vAlign w:val="center"/>
-          </w:tcPr>
-          <w:p>
-            <w:pPr>
-              <w:spacing w:after="120" w:before="0"/>
-              <w:jc w:val="left"/>
-            </w:pPr>
-            <w:r>
-              <w:rPr>
-                <w:rFonts w:ascii="Arial" w:cs="Arial" w:eastAsia="Arial" w:hAnsi="Arial"/>
-                <w:b w:val="false"/>
-                <w:bCs w:val="false"/>
-                <w:i w:val="false"/>
-                <w:iCs w:val="false"/>
-                <w:color w:val="1E293B"/>
-                <w:sz w:val="22"/>
-                <w:szCs w:val="22"/>
-              </w:rPr>
-              <w:t xml:space="preserve">Massinha de modelar</w:t>
-            </w:r>
-          </w:p>
-        </w:tc>
-        <w:tc>
-          <w:tcPr>
-            <w:tcW w:type="pct" w:w="20%"/>
+              <w:t xml:space="preserve">Todo Livro</w:t>
+            </w:r>
+          </w:p>
+        </w:tc>
+        <w:tc>
+          <w:tcPr>
+            <w:tcW w:type="pct" w:w="40%"/>
             <w:tcBorders>
               <w:top w:val="dashed" w:color="94A3B8" w:sz="6"/>
               <w:left w:val="dashed" w:color="94A3B8" w:sz="6"/>
@@ -1974,44 +1267,7 @@
         </w:tc>
         <w:tc>
           <w:tcPr>
-            <w:tcW w:type="pct" w:w="16%"/>
-            <w:tcBorders>
-              <w:top w:val="single" w:color="E2E8F0" w:sz="4"/>
-              <w:left w:val="single" w:color="E2E8F0" w:sz="4"/>
-              <w:bottom w:val="single" w:color="E2E8F0" w:sz="4"/>
-              <w:right w:val="single" w:color="E2E8F0" w:sz="4"/>
-            </w:tcBorders>
-            <w:tcMar>
-              <w:top w:type="dxa" w:w="110"/>
-              <w:left w:type="dxa" w:w="140"/>
-              <w:bottom w:type="dxa" w:w="110"/>
-              <w:right w:type="dxa" w:w="140"/>
-            </w:tcMar>
-            <w:vAlign w:val="center"/>
-          </w:tcPr>
-          <w:p>
-            <w:pPr>
-              <w:spacing w:after="120" w:before="0"/>
-              <w:jc w:val="left"/>
-            </w:pPr>
-            <w:r>
-              <w:rPr>
-                <w:rFonts w:ascii="Arial" w:cs="Arial" w:eastAsia="Arial" w:hAnsi="Arial"/>
-                <w:b w:val="false"/>
-                <w:bCs w:val="false"/>
-                <w:i w:val="false"/>
-                <w:iCs w:val="false"/>
-                <w:color w:val="1E293B"/>
-                <w:sz w:val="22"/>
-                <w:szCs w:val="22"/>
-              </w:rPr>
-              <w:t xml:space="preserve"/>
-            </w:r>
-          </w:p>
-        </w:tc>
-        <w:tc>
-          <w:tcPr>
-            <w:tcW w:type="pct" w:w="12%"/>
+            <w:tcW w:type="pct" w:w="30%"/>
             <w:tcBorders>
               <w:top w:val="single" w:color="E2E8F0" w:sz="4"/>
               <w:left w:val="single" w:color="E2E8F0" w:sz="4"/>
@@ -2050,7 +1306,7 @@
       <w:tr>
         <w:tc>
           <w:tcPr>
-            <w:tcW w:type="pct" w:w="20%"/>
+            <w:tcW w:type="pct" w:w="30%"/>
             <w:tcBorders>
               <w:top w:val="single" w:color="E2E8F0" w:sz="4"/>
               <w:left w:val="single" w:color="E2E8F0" w:sz="4"/>
@@ -2081,50 +1337,13 @@
                 <w:sz w:val="22"/>
                 <w:szCs w:val="22"/>
               </w:rPr>
-              <w:t xml:space="preserve">Manual do Mundo</w:t>
-            </w:r>
-          </w:p>
-        </w:tc>
-        <w:tc>
-          <w:tcPr>
-            <w:tcW w:type="pct" w:w="32%"/>
-            <w:tcBorders>
-              <w:top w:val="single" w:color="E2E8F0" w:sz="4"/>
-              <w:left w:val="single" w:color="E2E8F0" w:sz="4"/>
-              <w:bottom w:val="single" w:color="E2E8F0" w:sz="4"/>
-              <w:right w:val="single" w:color="E2E8F0" w:sz="4"/>
-            </w:tcBorders>
-            <w:tcMar>
-              <w:top w:type="dxa" w:w="110"/>
-              <w:left w:type="dxa" w:w="140"/>
-              <w:bottom w:type="dxa" w:w="110"/>
-              <w:right w:type="dxa" w:w="140"/>
-            </w:tcMar>
-            <w:vAlign w:val="center"/>
-          </w:tcPr>
-          <w:p>
-            <w:pPr>
-              <w:spacing w:after="120" w:before="0"/>
-              <w:jc w:val="left"/>
-            </w:pPr>
-            <w:r>
-              <w:rPr>
-                <w:rFonts w:ascii="Arial" w:cs="Arial" w:eastAsia="Arial" w:hAnsi="Arial"/>
-                <w:b w:val="false"/>
-                <w:bCs w:val="false"/>
-                <w:i w:val="false"/>
-                <w:iCs w:val="false"/>
-                <w:color w:val="1E293B"/>
-                <w:sz w:val="22"/>
-                <w:szCs w:val="22"/>
-              </w:rPr>
-              <w:t xml:space="preserve">Jogos licenciados (Inventa ou Responde, Laboratório)</w:t>
-            </w:r>
-          </w:p>
-        </w:tc>
-        <w:tc>
-          <w:tcPr>
-            <w:tcW w:type="pct" w:w="20%"/>
+              <w:t xml:space="preserve">Editora On-line</w:t>
+            </w:r>
+          </w:p>
+        </w:tc>
+        <w:tc>
+          <w:tcPr>
+            <w:tcW w:type="pct" w:w="40%"/>
             <w:tcBorders>
               <w:top w:val="dashed" w:color="94A3B8" w:sz="6"/>
               <w:left w:val="dashed" w:color="94A3B8" w:sz="6"/>
@@ -2161,44 +1380,7 @@
         </w:tc>
         <w:tc>
           <w:tcPr>
-            <w:tcW w:type="pct" w:w="16%"/>
-            <w:tcBorders>
-              <w:top w:val="single" w:color="E2E8F0" w:sz="4"/>
-              <w:left w:val="single" w:color="E2E8F0" w:sz="4"/>
-              <w:bottom w:val="single" w:color="E2E8F0" w:sz="4"/>
-              <w:right w:val="single" w:color="E2E8F0" w:sz="4"/>
-            </w:tcBorders>
-            <w:tcMar>
-              <w:top w:type="dxa" w:w="110"/>
-              <w:left w:type="dxa" w:w="140"/>
-              <w:bottom w:type="dxa" w:w="110"/>
-              <w:right w:type="dxa" w:w="140"/>
-            </w:tcMar>
-            <w:vAlign w:val="center"/>
-          </w:tcPr>
-          <w:p>
-            <w:pPr>
-              <w:spacing w:after="120" w:before="0"/>
-              <w:jc w:val="left"/>
-            </w:pPr>
-            <w:r>
-              <w:rPr>
-                <w:rFonts w:ascii="Arial" w:cs="Arial" w:eastAsia="Arial" w:hAnsi="Arial"/>
-                <w:b w:val="false"/>
-                <w:bCs w:val="false"/>
-                <w:i w:val="false"/>
-                <w:iCs w:val="false"/>
-                <w:color w:val="1E293B"/>
-                <w:sz w:val="22"/>
-                <w:szCs w:val="22"/>
-              </w:rPr>
-              <w:t xml:space="preserve"/>
-            </w:r>
-          </w:p>
-        </w:tc>
-        <w:tc>
-          <w:tcPr>
-            <w:tcW w:type="pct" w:w="12%"/>
+            <w:tcW w:type="pct" w:w="30%"/>
             <w:tcBorders>
               <w:top w:val="single" w:color="E2E8F0" w:sz="4"/>
               <w:left w:val="single" w:color="E2E8F0" w:sz="4"/>
@@ -2237,7 +1419,7 @@
       <w:tr>
         <w:tc>
           <w:tcPr>
-            <w:tcW w:type="pct" w:w="20%"/>
+            <w:tcW w:type="pct" w:w="30%"/>
             <w:tcBorders>
               <w:top w:val="single" w:color="E2E8F0" w:sz="4"/>
               <w:left w:val="single" w:color="E2E8F0" w:sz="4"/>
@@ -2268,50 +1450,13 @@
                 <w:sz w:val="22"/>
                 <w:szCs w:val="22"/>
               </w:rPr>
-              <w:t xml:space="preserve">Hot Wheels (Mattel)</w:t>
-            </w:r>
-          </w:p>
-        </w:tc>
-        <w:tc>
-          <w:tcPr>
-            <w:tcW w:type="pct" w:w="32%"/>
-            <w:tcBorders>
-              <w:top w:val="single" w:color="E2E8F0" w:sz="4"/>
-              <w:left w:val="single" w:color="E2E8F0" w:sz="4"/>
-              <w:bottom w:val="single" w:color="E2E8F0" w:sz="4"/>
-              <w:right w:val="single" w:color="E2E8F0" w:sz="4"/>
-            </w:tcBorders>
-            <w:tcMar>
-              <w:top w:type="dxa" w:w="110"/>
-              <w:left w:type="dxa" w:w="140"/>
-              <w:bottom w:type="dxa" w:w="110"/>
-              <w:right w:type="dxa" w:w="140"/>
-            </w:tcMar>
-            <w:vAlign w:val="center"/>
-          </w:tcPr>
-          <w:p>
-            <w:pPr>
-              <w:spacing w:after="120" w:before="0"/>
-              <w:jc w:val="left"/>
-            </w:pPr>
-            <w:r>
-              <w:rPr>
-                <w:rFonts w:ascii="Arial" w:cs="Arial" w:eastAsia="Arial" w:hAnsi="Arial"/>
-                <w:b w:val="false"/>
-                <w:bCs w:val="false"/>
-                <w:i w:val="false"/>
-                <w:iCs w:val="false"/>
-                <w:color w:val="1E293B"/>
-                <w:sz w:val="22"/>
-                <w:szCs w:val="22"/>
-              </w:rPr>
-              <w:t xml:space="preserve">Playset Pit Stop</w:t>
-            </w:r>
-          </w:p>
-        </w:tc>
-        <w:tc>
-          <w:tcPr>
-            <w:tcW w:type="pct" w:w="20%"/>
+              <w:t xml:space="preserve">Tris</w:t>
+            </w:r>
+          </w:p>
+        </w:tc>
+        <w:tc>
+          <w:tcPr>
+            <w:tcW w:type="pct" w:w="40%"/>
             <w:tcBorders>
               <w:top w:val="dashed" w:color="94A3B8" w:sz="6"/>
               <w:left w:val="dashed" w:color="94A3B8" w:sz="6"/>
@@ -2348,7 +1493,46 @@
         </w:tc>
         <w:tc>
           <w:tcPr>
-            <w:tcW w:type="pct" w:w="16%"/>
+            <w:tcW w:type="pct" w:w="30%"/>
+            <w:tcBorders>
+              <w:top w:val="single" w:color="E2E8F0" w:sz="4"/>
+              <w:left w:val="single" w:color="E2E8F0" w:sz="4"/>
+              <w:bottom w:val="single" w:color="E2E8F0" w:sz="4"/>
+              <w:right w:val="single" w:color="E2E8F0" w:sz="4"/>
+            </w:tcBorders>
+            <w:tcMar>
+              <w:top w:type="dxa" w:w="110"/>
+              <w:left w:type="dxa" w:w="140"/>
+              <w:bottom w:type="dxa" w:w="110"/>
+              <w:right w:type="dxa" w:w="140"/>
+            </w:tcMar>
+            <w:vAlign w:val="center"/>
+          </w:tcPr>
+          <w:p>
+            <w:pPr>
+              <w:spacing w:after="120" w:before="0"/>
+              <w:jc w:val="center"/>
+            </w:pPr>
+            <w:r>
+              <w:rPr>
+                <w:rFonts w:ascii="Arial" w:cs="Arial" w:eastAsia="Arial" w:hAnsi="Arial"/>
+                <w:b w:val="false"/>
+                <w:bCs w:val="false"/>
+                <w:i w:val="false"/>
+                <w:iCs w:val="false"/>
+                <w:color w:val="D97706"/>
+                <w:sz w:val="22"/>
+                <w:szCs w:val="22"/>
+              </w:rPr>
+              <w:t xml:space="preserve">☐ Pendente</w:t>
+            </w:r>
+          </w:p>
+        </w:tc>
+      </w:tr>
+      <w:tr>
+        <w:tc>
+          <w:tcPr>
+            <w:tcW w:type="pct" w:w="30%"/>
             <w:tcBorders>
               <w:top w:val="single" w:color="E2E8F0" w:sz="4"/>
               <w:left w:val="single" w:color="E2E8F0" w:sz="4"/>
@@ -2371,21 +1555,58 @@
             <w:r>
               <w:rPr>
                 <w:rFonts w:ascii="Arial" w:cs="Arial" w:eastAsia="Arial" w:hAnsi="Arial"/>
-                <w:b w:val="false"/>
-                <w:bCs w:val="false"/>
+                <w:b/>
+                <w:bCs/>
                 <w:i w:val="false"/>
                 <w:iCs w:val="false"/>
                 <w:color w:val="1E293B"/>
                 <w:sz w:val="22"/>
                 <w:szCs w:val="22"/>
               </w:rPr>
-              <w:t xml:space="preserve"/>
-            </w:r>
-          </w:p>
-        </w:tc>
-        <w:tc>
-          <w:tcPr>
-            <w:tcW w:type="pct" w:w="12%"/>
+              <w:t xml:space="preserve">Lyke</w:t>
+            </w:r>
+          </w:p>
+        </w:tc>
+        <w:tc>
+          <w:tcPr>
+            <w:tcW w:type="pct" w:w="40%"/>
+            <w:tcBorders>
+              <w:top w:val="dashed" w:color="94A3B8" w:sz="6"/>
+              <w:left w:val="dashed" w:color="94A3B8" w:sz="6"/>
+              <w:bottom w:val="dashed" w:color="94A3B8" w:sz="6"/>
+              <w:right w:val="dashed" w:color="94A3B8" w:sz="6"/>
+            </w:tcBorders>
+            <w:tcMar>
+              <w:top w:type="dxa" w:w="260"/>
+              <w:left w:type="dxa" w:w="100"/>
+              <w:bottom w:type="dxa" w:w="260"/>
+              <w:right w:type="dxa" w:w="100"/>
+            </w:tcMar>
+            <w:vAlign w:val="center"/>
+          </w:tcPr>
+          <w:p>
+            <w:pPr>
+              <w:spacing w:after="120" w:before="0"/>
+              <w:jc w:val="center"/>
+            </w:pPr>
+            <w:r>
+              <w:rPr>
+                <w:rFonts w:ascii="Arial" w:cs="Arial" w:eastAsia="Arial" w:hAnsi="Arial"/>
+                <w:b w:val="false"/>
+                <w:bCs w:val="false"/>
+                <w:i/>
+                <w:iCs/>
+                <w:color w:val="94A3B8"/>
+                <w:sz w:val="18"/>
+                <w:szCs w:val="18"/>
+              </w:rPr>
+              <w:t xml:space="preserve">cole a logo aqui</w:t>
+            </w:r>
+          </w:p>
+        </w:tc>
+        <w:tc>
+          <w:tcPr>
+            <w:tcW w:type="pct" w:w="30%"/>
             <w:tcBorders>
               <w:top w:val="single" w:color="E2E8F0" w:sz="4"/>
               <w:left w:val="single" w:color="E2E8F0" w:sz="4"/>
@@ -2822,7 +2043,7 @@
           <w:sz w:val="22"/>
           <w:szCs w:val="22"/>
         </w:rPr>
-        <w:t xml:space="preserve">Na página "Produtos" (produtos.html), seção "Marcas que trabalhamos" — uma grade de cards, um por marca. Cada card tem hoje um ícone de câmera de espaço reservado (placeholder); quando a logo chegar, é só substituir a imagem no Elementor (widget Image dentro do Image Box).</w:t>
+        <w:t xml:space="preserve">Na página "Produtos" (produtos.html), seção "Marcas que trabalhamos" — uma grade de 12 cards, um por fábrica. Cada card tem hoje um ícone de câmera de espaço reservado (placeholder); quando a logo chegar, é só substituir a imagem no Elementor (widget Image dentro do Image Box).</w:t>
       </w:r>
     </w:p>
     <w:sectPr>
@@ -2981,7 +2202,7 @@
         <w:sz w:val="18"/>
         <w:szCs w:val="18"/>
       </w:rPr>
-      <w:t xml:space="preserve">		Levantamento de Logos — Marcas Parceiras</w:t>
+      <w:t xml:space="preserve">		Levantamento de Logos — Fábricas Parceiras</w:t>
     </w:r>
   </w:p>
 </w:hdr>

</xml_diff>